<commit_message>
Add AI mastery workflow and final RL project
</commit_message>
<xml_diff>
--- a/materials/Лабораторная работа 1 Бандит и CEM.docx
+++ b/materials/Лабораторная работа 1 Бандит и CEM.docx
@@ -5,20 +5,7 @@
     <w:p>
       <w:pPr>
         <w:pStyle w:val="Title"/>
-        <w:jc w:val="center"/>
-      </w:pPr>
-      <w:r>
-        <w:rPr>
-          <w:rFonts w:ascii="Times New Roman" w:hAnsi="Times New Roman" w:eastAsia="Times New Roman"/>
-          <w:b/>
-          <w:sz w:val="36"/>
-        </w:rPr>
-        <w:t>Лабораторная работа 1 Многорукий бандит и Cross-Entropy Method</w:t>
-      </w:r>
-    </w:p>
-    <w:p>
-      <w:pPr>
-        <w:ind w:firstLine="0"/>
+        <w:spacing w:line="360" w:lineRule="auto" w:after="120"/>
         <w:jc w:val="center"/>
       </w:pPr>
       <w:r>
@@ -27,18 +14,19 @@
           <w:b/>
           <w:sz w:val="28"/>
         </w:rPr>
-        <w:t>Дисциплина Прикладные задачи машинного обучения</w:t>
+        <w:t>Лабораторная работа 1 Многорукий бандит и Cross-Entropy Method</w:t>
       </w:r>
     </w:p>
     <w:p>
       <w:pPr>
+        <w:spacing w:line="360" w:lineRule="auto" w:after="120"/>
         <w:ind w:firstLine="0"/>
         <w:jc w:val="center"/>
       </w:pPr>
       <w:r>
         <w:rPr>
           <w:rFonts w:ascii="Times New Roman" w:hAnsi="Times New Roman" w:eastAsia="Times New Roman"/>
-          <w:sz w:val="24"/>
+          <w:sz w:val="28"/>
         </w:rPr>
         <w:t>Никитин Пётр Владимирович  Кафедра искусственного интеллекта ФУ</w:t>
       </w:r>
@@ -46,17 +34,21 @@
     <w:p>
       <w:pPr>
         <w:pStyle w:val="Heading1"/>
+        <w:spacing w:line="360" w:lineRule="auto" w:after="120"/>
       </w:pPr>
       <w:r>
         <w:rPr>
           <w:rFonts w:ascii="Times New Roman" w:hAnsi="Times New Roman" w:eastAsia="Times New Roman"/>
           <w:b/>
-          <w:sz w:val="32"/>
+          <w:sz w:val="28"/>
         </w:rPr>
         <w:t>Цель</w:t>
       </w:r>
     </w:p>
     <w:p>
+      <w:pPr>
+        <w:spacing w:line="360" w:lineRule="auto" w:after="120"/>
+      </w:pPr>
       <w:r>
         <w:rPr>
           <w:rFonts w:ascii="Times New Roman" w:hAnsi="Times New Roman" w:eastAsia="Times New Roman"/>
@@ -68,12 +60,13 @@
     <w:p>
       <w:pPr>
         <w:pStyle w:val="Heading1"/>
+        <w:spacing w:line="360" w:lineRule="auto" w:after="120"/>
       </w:pPr>
       <w:r>
         <w:rPr>
           <w:rFonts w:ascii="Times New Roman" w:hAnsi="Times New Roman" w:eastAsia="Times New Roman"/>
           <w:b/>
-          <w:sz w:val="32"/>
+          <w:sz w:val="28"/>
         </w:rPr>
         <w:t>Задачи</w:t>
       </w:r>
@@ -81,6 +74,7 @@
     <w:p>
       <w:pPr>
         <w:pStyle w:val="ListParagraph"/>
+        <w:spacing w:line="360" w:lineRule="auto" w:after="120"/>
         <w:ind w:left="709" w:hanging="340"/>
       </w:pPr>
       <w:r>
@@ -101,6 +95,7 @@
     <w:p>
       <w:pPr>
         <w:pStyle w:val="ListParagraph"/>
+        <w:spacing w:line="360" w:lineRule="auto" w:after="120"/>
         <w:ind w:left="709" w:hanging="340"/>
       </w:pPr>
       <w:r>
@@ -121,6 +116,7 @@
     <w:p>
       <w:pPr>
         <w:pStyle w:val="ListParagraph"/>
+        <w:spacing w:line="360" w:lineRule="auto" w:after="120"/>
         <w:ind w:left="709" w:hanging="340"/>
       </w:pPr>
       <w:r>
@@ -141,6 +137,7 @@
     <w:p>
       <w:pPr>
         <w:pStyle w:val="ListParagraph"/>
+        <w:spacing w:line="360" w:lineRule="auto" w:after="120"/>
         <w:ind w:left="709" w:hanging="340"/>
       </w:pPr>
       <w:r>
@@ -161,6 +158,7 @@
     <w:p>
       <w:pPr>
         <w:pStyle w:val="ListParagraph"/>
+        <w:spacing w:line="360" w:lineRule="auto" w:after="120"/>
         <w:ind w:left="709" w:hanging="340"/>
       </w:pPr>
       <w:r>
@@ -181,6 +179,7 @@
     <w:p>
       <w:pPr>
         <w:pStyle w:val="ListParagraph"/>
+        <w:spacing w:line="360" w:lineRule="auto" w:after="120"/>
         <w:ind w:left="709" w:hanging="340"/>
       </w:pPr>
       <w:r>
@@ -201,17 +200,21 @@
     <w:p>
       <w:pPr>
         <w:pStyle w:val="Heading1"/>
+        <w:spacing w:line="360" w:lineRule="auto" w:after="120"/>
       </w:pPr>
       <w:r>
         <w:rPr>
           <w:rFonts w:ascii="Times New Roman" w:hAnsi="Times New Roman" w:eastAsia="Times New Roman"/>
           <w:b/>
-          <w:sz w:val="32"/>
+          <w:sz w:val="28"/>
         </w:rPr>
         <w:t>Задание 1. Многорукий бандит</w:t>
       </w:r>
     </w:p>
     <w:p>
+      <w:pPr>
+        <w:spacing w:line="360" w:lineRule="auto" w:after="120"/>
+      </w:pPr>
       <w:r>
         <w:rPr>
           <w:rFonts w:ascii="Times New Roman" w:hAnsi="Times New Roman" w:eastAsia="Times New Roman"/>
@@ -222,26 +225,28 @@
     </w:p>
     <w:p>
       <w:pPr>
+        <w:spacing w:line="360" w:lineRule="auto" w:after="120"/>
         <w:ind w:firstLine="0"/>
         <w:jc w:val="center"/>
       </w:pPr>
       <w:r>
         <w:rPr>
           <w:rFonts w:ascii="Times New Roman" w:hAnsi="Times New Roman" w:eastAsia="Times New Roman"/>
-          <w:sz w:val="26"/>
+          <w:sz w:val="28"/>
         </w:rPr>
         <w:t>Qₙ₊₁(a) = Qₙ(a) + 1/Nₙ(a) · [Rₙ − Qₙ(a)]</w:t>
       </w:r>
     </w:p>
     <w:p>
       <w:pPr>
+        <w:spacing w:line="360" w:lineRule="auto" w:after="120"/>
         <w:ind w:firstLine="0"/>
         <w:jc w:val="center"/>
       </w:pPr>
       <w:r>
         <w:rPr>
           <w:rFonts w:ascii="Times New Roman" w:hAnsi="Times New Roman" w:eastAsia="Times New Roman"/>
-          <w:sz w:val="26"/>
+          <w:sz w:val="28"/>
         </w:rPr>
         <w:t>UCBₜ(a) = Qₜ(a) + c · √(ln t / Nₜ(a));   Regret(T) = Tμ* − Σₜ μ(aₜ)</w:t>
       </w:r>
@@ -614,17 +619,21 @@
     <w:p>
       <w:pPr>
         <w:pStyle w:val="Heading1"/>
+        <w:spacing w:line="360" w:lineRule="auto" w:after="120"/>
       </w:pPr>
       <w:r>
         <w:rPr>
           <w:rFonts w:ascii="Times New Roman" w:hAnsi="Times New Roman" w:eastAsia="Times New Roman"/>
           <w:b/>
-          <w:sz w:val="32"/>
+          <w:sz w:val="28"/>
         </w:rPr>
         <w:t>Задание 2. Собака и кость</w:t>
       </w:r>
     </w:p>
     <w:p>
+      <w:pPr>
+        <w:spacing w:line="360" w:lineRule="auto" w:after="120"/>
+      </w:pPr>
       <w:r>
         <w:rPr>
           <w:rFonts w:ascii="Times New Roman" w:hAnsi="Times New Roman" w:eastAsia="Times New Roman"/>
@@ -635,26 +644,28 @@
     </w:p>
     <w:p>
       <w:pPr>
+        <w:spacing w:line="360" w:lineRule="auto" w:after="120"/>
         <w:ind w:firstLine="0"/>
         <w:jc w:val="center"/>
       </w:pPr>
       <w:r>
         <w:rPr>
           <w:rFonts w:ascii="Times New Roman" w:hAnsi="Times New Roman" w:eastAsia="Times New Roman"/>
-          <w:sz w:val="26"/>
+          <w:sz w:val="28"/>
         </w:rPr>
         <w:t>γᵢ = Quantile_q({G(τ₁), …, G(τ_N)});   D_elite = {(sₜ,aₜ) ∈ τᵢ | G(τᵢ) ≥ γᵢ}</w:t>
       </w:r>
     </w:p>
     <w:p>
       <w:pPr>
+        <w:spacing w:line="360" w:lineRule="auto" w:after="120"/>
         <w:ind w:firstLine="0"/>
         <w:jc w:val="center"/>
       </w:pPr>
       <w:r>
         <w:rPr>
           <w:rFonts w:ascii="Times New Roman" w:hAnsi="Times New Roman" w:eastAsia="Times New Roman"/>
-          <w:sz w:val="26"/>
+          <w:sz w:val="28"/>
         </w:rPr>
         <w:t>θᵢ₊₁ = argmax_θ Σ_(s,a)∈D_elite log π_θ(a|s)</w:t>
       </w:r>
@@ -662,17 +673,21 @@
     <w:p>
       <w:pPr>
         <w:pStyle w:val="Heading1"/>
+        <w:spacing w:line="360" w:lineRule="auto" w:after="120"/>
       </w:pPr>
       <w:r>
         <w:rPr>
           <w:rFonts w:ascii="Times New Roman" w:hAnsi="Times New Roman" w:eastAsia="Times New Roman"/>
           <w:b/>
-          <w:sz w:val="32"/>
+          <w:sz w:val="28"/>
         </w:rPr>
         <w:t>Полный пример</w:t>
       </w:r>
     </w:p>
     <w:p>
+      <w:pPr>
+        <w:spacing w:line="360" w:lineRule="auto" w:after="120"/>
+      </w:pPr>
       <w:r>
         <w:rPr>
           <w:rFonts w:ascii="Times New Roman" w:hAnsi="Times New Roman" w:eastAsia="Times New Roman"/>
@@ -1133,6 +1148,9 @@
       </w:pPr>
     </w:p>
     <w:p>
+      <w:pPr>
+        <w:spacing w:line="360" w:lineRule="auto" w:after="120"/>
+      </w:pPr>
       <w:r>
         <w:rPr>
           <w:rFonts w:ascii="Times New Roman" w:hAnsi="Times New Roman" w:eastAsia="Times New Roman"/>
@@ -1144,12 +1162,13 @@
     <w:p>
       <w:pPr>
         <w:pStyle w:val="Heading1"/>
+        <w:spacing w:line="360" w:lineRule="auto" w:after="120"/>
       </w:pPr>
       <w:r>
         <w:rPr>
           <w:rFonts w:ascii="Times New Roman" w:hAnsi="Times New Roman" w:eastAsia="Times New Roman"/>
           <w:b/>
-          <w:sz w:val="32"/>
+          <w:sz w:val="28"/>
         </w:rPr>
         <w:t>Минимальный состав отчёта</w:t>
       </w:r>
@@ -1157,6 +1176,7 @@
     <w:p>
       <w:pPr>
         <w:pStyle w:val="ListParagraph"/>
+        <w:spacing w:line="360" w:lineRule="auto" w:after="120"/>
         <w:ind w:left="709" w:hanging="340"/>
       </w:pPr>
       <w:r>
@@ -1177,6 +1197,7 @@
     <w:p>
       <w:pPr>
         <w:pStyle w:val="ListParagraph"/>
+        <w:spacing w:line="360" w:lineRule="auto" w:after="120"/>
         <w:ind w:left="709" w:hanging="340"/>
       </w:pPr>
       <w:r>
@@ -1197,6 +1218,7 @@
     <w:p>
       <w:pPr>
         <w:pStyle w:val="ListParagraph"/>
+        <w:spacing w:line="360" w:lineRule="auto" w:after="120"/>
         <w:ind w:left="709" w:hanging="340"/>
       </w:pPr>
       <w:r>
@@ -1217,6 +1239,7 @@
     <w:p>
       <w:pPr>
         <w:pStyle w:val="ListParagraph"/>
+        <w:spacing w:line="360" w:lineRule="auto" w:after="120"/>
         <w:ind w:left="709" w:hanging="340"/>
       </w:pPr>
       <w:r>
@@ -1237,6 +1260,7 @@
     <w:p>
       <w:pPr>
         <w:pStyle w:val="ListParagraph"/>
+        <w:spacing w:line="360" w:lineRule="auto" w:after="120"/>
         <w:ind w:left="709" w:hanging="340"/>
       </w:pPr>
       <w:r>
@@ -1257,6 +1281,7 @@
     <w:p>
       <w:pPr>
         <w:pStyle w:val="ListParagraph"/>
+        <w:spacing w:line="360" w:lineRule="auto" w:after="120"/>
         <w:ind w:left="709" w:hanging="340"/>
       </w:pPr>
       <w:r>
@@ -1277,12 +1302,13 @@
     <w:p>
       <w:pPr>
         <w:pStyle w:val="Heading1"/>
+        <w:spacing w:line="360" w:lineRule="auto" w:after="120"/>
       </w:pPr>
       <w:r>
         <w:rPr>
           <w:rFonts w:ascii="Times New Roman" w:hAnsi="Times New Roman" w:eastAsia="Times New Roman"/>
           <w:b/>
-          <w:sz w:val="32"/>
+          <w:sz w:val="28"/>
         </w:rPr>
         <w:t>Оценивание</w:t>
       </w:r>
@@ -1655,6 +1681,9 @@
       </w:pPr>
     </w:p>
     <w:p>
+      <w:pPr>
+        <w:spacing w:line="360" w:lineRule="auto" w:after="120"/>
+      </w:pPr>
       <w:r>
         <w:rPr>
           <w:rFonts w:ascii="Times New Roman" w:hAnsi="Times New Roman" w:eastAsia="Times New Roman"/>
@@ -1666,60 +1695,750 @@
     <w:p>
       <w:pPr>
         <w:pStyle w:val="Heading1"/>
+        <w:spacing w:line="360" w:lineRule="auto" w:after="120"/>
+      </w:pPr>
+      <w:r>
+        <w:rPr>
+          <w:rFonts w:ascii="Times New Roman" w:hAnsi="Times New Roman" w:eastAsia="Times New Roman"/>
+          <w:sz w:val="28"/>
+        </w:rPr>
+        <w:t>Мастерство применения искусственного интеллекта</w:t>
+      </w:r>
+    </w:p>
+    <w:p>
+      <w:pPr>
+        <w:spacing w:line="360" w:lineRule="auto" w:after="120"/>
+      </w:pPr>
+      <w:r>
+        <w:rPr>
+          <w:rFonts w:ascii="Times New Roman" w:hAnsi="Times New Roman" w:eastAsia="Times New Roman"/>
+          <w:sz w:val="28"/>
+        </w:rPr>
+        <w:t>ИИ используется как исследовательский помощник: помогает уточнить вопрос и гипотезу, предложить поисковые запросы, найти слабые места плана и подготовить варианты объяснения. ИИ не заменяет чтение первоисточников, выполнение кода, расчёт метрик и аргументированный вывод студента.</w:t>
+      </w:r>
+    </w:p>
+    <w:p>
+      <w:pPr>
+        <w:spacing w:line="360" w:lineRule="auto" w:after="120"/>
       </w:pPr>
       <w:r>
         <w:rPr>
           <w:rFonts w:ascii="Times New Roman" w:hAnsi="Times New Roman" w:eastAsia="Times New Roman"/>
           <w:b/>
-          <w:sz w:val="32"/>
+          <w:sz w:val="28"/>
+        </w:rPr>
+        <w:t>Плохой промпт.</w:t>
+      </w:r>
+      <w:r>
+        <w:rPr>
+          <w:rFonts w:ascii="Times New Roman" w:hAnsi="Times New Roman" w:eastAsia="Times New Roman"/>
+          <w:sz w:val="28"/>
+        </w:rPr>
+        <w:t xml:space="preserve"> Расскажи, какая стратегия бандита лучше, и придумай результаты.</w:t>
+      </w:r>
+    </w:p>
+    <w:p>
+      <w:pPr>
+        <w:spacing w:line="360" w:lineRule="auto" w:after="120"/>
+      </w:pPr>
+      <w:r>
+        <w:rPr>
+          <w:rFonts w:ascii="Times New Roman" w:hAnsi="Times New Roman" w:eastAsia="Times New Roman"/>
+          <w:b/>
+          <w:sz w:val="28"/>
+        </w:rPr>
+        <w:t>Хороший промпт.</w:t>
+      </w:r>
+      <w:r>
+        <w:rPr>
+          <w:rFonts w:ascii="Times New Roman" w:hAnsi="Times New Roman" w:eastAsia="Times New Roman"/>
+          <w:sz w:val="28"/>
+        </w:rPr>
+        <w:t xml:space="preserve"> Помоги сформулировать проверяемые H0 и H1 для сравнения epsilon-greedy, UCB1 и Thompson sampling. Условия: четыре Bernoulli-руки, 1000 шагов, 20 seed; критерии: cumulative regret, доля оптимальных действий и 95-процентный доверительный интервал. Не придумывай результаты. Отдельно перечисли допущения и план проверки.</w:t>
+      </w:r>
+    </w:p>
+    <w:p>
+      <w:pPr>
+        <w:spacing w:line="360" w:lineRule="auto" w:after="120"/>
+      </w:pPr>
+      <w:r>
+        <w:rPr>
+          <w:rFonts w:ascii="Times New Roman" w:hAnsi="Times New Roman" w:eastAsia="Times New Roman"/>
+          <w:b/>
+          <w:sz w:val="28"/>
+        </w:rPr>
+        <w:t>Ответ ИИ.</w:t>
+      </w:r>
+      <w:r>
+        <w:rPr>
+          <w:rFonts w:ascii="Times New Roman" w:hAnsi="Times New Roman" w:eastAsia="Times New Roman"/>
+          <w:sz w:val="28"/>
+        </w:rPr>
+        <w:t xml:space="preserve"> ИИ предположил, что Thompson sampling обязательно даст минимальный regret.</w:t>
+      </w:r>
+    </w:p>
+    <w:p>
+      <w:pPr>
+        <w:spacing w:line="360" w:lineRule="auto" w:after="120"/>
+      </w:pPr>
+      <w:r>
+        <w:rPr>
+          <w:rFonts w:ascii="Times New Roman" w:hAnsi="Times New Roman" w:eastAsia="Times New Roman"/>
+          <w:b/>
+          <w:sz w:val="28"/>
+        </w:rPr>
+        <w:t>Проверка студентом.</w:t>
+      </w:r>
+      <w:r>
+        <w:rPr>
+          <w:rFonts w:ascii="Times New Roman" w:hAnsi="Times New Roman" w:eastAsia="Times New Roman"/>
+          <w:sz w:val="28"/>
+        </w:rPr>
+        <w:t xml:space="preserve"> Вывод не принимается без эксперимента. Студент фиксирует вероятности рук и seed, запускает одинаковый протокол для всех стратегий, строит интервалы неопределённости и проверяет устойчивость ранжирования.</w:t>
+      </w:r>
+    </w:p>
+    <w:p>
+      <w:pPr>
+        <w:pStyle w:val="Heading2"/>
+        <w:spacing w:line="360" w:lineRule="auto" w:after="120"/>
+      </w:pPr>
+      <w:r>
+        <w:rPr>
+          <w:rFonts w:ascii="Times New Roman" w:hAnsi="Times New Roman" w:eastAsia="Times New Roman"/>
+          <w:sz w:val="28"/>
+        </w:rPr>
+        <w:t>Журнал эксперимента</w:t>
+      </w:r>
+    </w:p>
+    <w:p>
+      <w:pPr>
+        <w:spacing w:line="360" w:lineRule="auto" w:after="120"/>
+      </w:pPr>
+      <w:r>
+        <w:rPr>
+          <w:rFonts w:ascii="Times New Roman" w:hAnsi="Times New Roman" w:eastAsia="Times New Roman"/>
+          <w:sz w:val="28"/>
+        </w:rPr>
+        <w:t>Каждый содержательный запрос к ИИ и связанный с ним эксперимент фиксируются до интерпретации результата. Запись должна позволять другому человеку понять происхождение данных, повторить запуск и отделить ответ модели от доказательства.</w:t>
+      </w:r>
+    </w:p>
+    <w:tbl>
+      <w:tblPr>
+        <w:tblStyle w:val="TableGrid"/>
+        <w:tblW w:type="auto" w:w="0"/>
+        <w:tblLook w:firstColumn="1" w:firstRow="1" w:lastColumn="0" w:lastRow="0" w:noHBand="0" w:noVBand="1" w:val="04A0"/>
+      </w:tblPr>
+      <w:tblGrid>
+        <w:gridCol w:w="4844"/>
+        <w:gridCol w:w="4844"/>
+      </w:tblGrid>
+      <w:tr>
+        <w:tc>
+          <w:tcPr>
+            <w:tcW w:type="dxa" w:w="4844"/>
+            <w:vAlign w:val="center"/>
+            <w:tcMar>
+              <w:top w:w="90" w:type="dxa"/>
+              <w:start w:w="110" w:type="dxa"/>
+              <w:bottom w:w="90" w:type="dxa"/>
+              <w:end w:w="110" w:type="dxa"/>
+            </w:tcMar>
+          </w:tcPr>
+          <w:p>
+            <w:pPr>
+              <w:spacing w:line="360" w:lineRule="auto" w:after="0"/>
+            </w:pPr>
+            <w:r>
+              <w:rPr>
+                <w:rFonts w:ascii="Times New Roman" w:hAnsi="Times New Roman" w:eastAsia="Times New Roman"/>
+                <w:b/>
+                <w:sz w:val="26"/>
+              </w:rPr>
+              <w:t>Поле</w:t>
+            </w:r>
+          </w:p>
+        </w:tc>
+        <w:tc>
+          <w:tcPr>
+            <w:tcW w:type="dxa" w:w="4844"/>
+            <w:vAlign w:val="center"/>
+            <w:tcMar>
+              <w:top w:w="90" w:type="dxa"/>
+              <w:start w:w="110" w:type="dxa"/>
+              <w:bottom w:w="90" w:type="dxa"/>
+              <w:end w:w="110" w:type="dxa"/>
+            </w:tcMar>
+          </w:tcPr>
+          <w:p>
+            <w:pPr>
+              <w:spacing w:line="360" w:lineRule="auto" w:after="0"/>
+            </w:pPr>
+            <w:r>
+              <w:rPr>
+                <w:rFonts w:ascii="Times New Roman" w:hAnsi="Times New Roman" w:eastAsia="Times New Roman"/>
+                <w:b/>
+                <w:sz w:val="26"/>
+              </w:rPr>
+              <w:t>Что фиксируется</w:t>
+            </w:r>
+          </w:p>
+        </w:tc>
+      </w:tr>
+      <w:tr>
+        <w:tc>
+          <w:tcPr>
+            <w:tcW w:type="dxa" w:w="4844"/>
+            <w:vAlign w:val="center"/>
+            <w:tcMar>
+              <w:top w:w="90" w:type="dxa"/>
+              <w:start w:w="110" w:type="dxa"/>
+              <w:bottom w:w="90" w:type="dxa"/>
+              <w:end w:w="110" w:type="dxa"/>
+            </w:tcMar>
+          </w:tcPr>
+          <w:p>
+            <w:pPr>
+              <w:spacing w:line="360" w:lineRule="auto" w:after="0"/>
+            </w:pPr>
+            <w:r>
+              <w:rPr>
+                <w:rFonts w:ascii="Times New Roman" w:hAnsi="Times New Roman" w:eastAsia="Times New Roman"/>
+                <w:b w:val="0"/>
+                <w:sz w:val="24"/>
+              </w:rPr>
+              <w:t>Модель ИИ</w:t>
+            </w:r>
+          </w:p>
+        </w:tc>
+        <w:tc>
+          <w:tcPr>
+            <w:tcW w:type="dxa" w:w="4844"/>
+            <w:vAlign w:val="center"/>
+            <w:tcMar>
+              <w:top w:w="90" w:type="dxa"/>
+              <w:start w:w="110" w:type="dxa"/>
+              <w:bottom w:w="90" w:type="dxa"/>
+              <w:end w:w="110" w:type="dxa"/>
+            </w:tcMar>
+          </w:tcPr>
+          <w:p>
+            <w:pPr>
+              <w:spacing w:line="360" w:lineRule="auto" w:after="0"/>
+            </w:pPr>
+            <w:r>
+              <w:rPr>
+                <w:rFonts w:ascii="Times New Roman" w:hAnsi="Times New Roman" w:eastAsia="Times New Roman"/>
+                <w:b w:val="0"/>
+                <w:sz w:val="24"/>
+              </w:rPr>
+              <w:t>Название, версия или дата доступа; режим и ограничения.</w:t>
+            </w:r>
+          </w:p>
+        </w:tc>
+      </w:tr>
+      <w:tr>
+        <w:tc>
+          <w:tcPr>
+            <w:tcW w:type="dxa" w:w="4844"/>
+            <w:vAlign w:val="center"/>
+            <w:tcMar>
+              <w:top w:w="90" w:type="dxa"/>
+              <w:start w:w="110" w:type="dxa"/>
+              <w:bottom w:w="90" w:type="dxa"/>
+              <w:end w:w="110" w:type="dxa"/>
+            </w:tcMar>
+          </w:tcPr>
+          <w:p>
+            <w:pPr>
+              <w:spacing w:line="360" w:lineRule="auto" w:after="0"/>
+            </w:pPr>
+            <w:r>
+              <w:rPr>
+                <w:rFonts w:ascii="Times New Roman" w:hAnsi="Times New Roman" w:eastAsia="Times New Roman"/>
+                <w:b w:val="0"/>
+                <w:sz w:val="24"/>
+              </w:rPr>
+              <w:t>Дата и автор записи</w:t>
+            </w:r>
+          </w:p>
+        </w:tc>
+        <w:tc>
+          <w:tcPr>
+            <w:tcW w:type="dxa" w:w="4844"/>
+            <w:vAlign w:val="center"/>
+            <w:tcMar>
+              <w:top w:w="90" w:type="dxa"/>
+              <w:start w:w="110" w:type="dxa"/>
+              <w:bottom w:w="90" w:type="dxa"/>
+              <w:end w:w="110" w:type="dxa"/>
+            </w:tcMar>
+          </w:tcPr>
+          <w:p>
+            <w:pPr>
+              <w:spacing w:line="360" w:lineRule="auto" w:after="0"/>
+            </w:pPr>
+            <w:r>
+              <w:rPr>
+                <w:rFonts w:ascii="Times New Roman" w:hAnsi="Times New Roman" w:eastAsia="Times New Roman"/>
+                <w:b w:val="0"/>
+                <w:sz w:val="24"/>
+              </w:rPr>
+              <w:t>Дата эксперимента и обезличенный идентификатор участника или команды.</w:t>
+            </w:r>
+          </w:p>
+        </w:tc>
+      </w:tr>
+      <w:tr>
+        <w:tc>
+          <w:tcPr>
+            <w:tcW w:type="dxa" w:w="4844"/>
+            <w:vAlign w:val="center"/>
+            <w:tcMar>
+              <w:top w:w="90" w:type="dxa"/>
+              <w:start w:w="110" w:type="dxa"/>
+              <w:bottom w:w="90" w:type="dxa"/>
+              <w:end w:w="110" w:type="dxa"/>
+            </w:tcMar>
+          </w:tcPr>
+          <w:p>
+            <w:pPr>
+              <w:spacing w:line="360" w:lineRule="auto" w:after="0"/>
+            </w:pPr>
+            <w:r>
+              <w:rPr>
+                <w:rFonts w:ascii="Times New Roman" w:hAnsi="Times New Roman" w:eastAsia="Times New Roman"/>
+                <w:b w:val="0"/>
+                <w:sz w:val="24"/>
+              </w:rPr>
+              <w:t>Промпт</w:t>
+            </w:r>
+          </w:p>
+        </w:tc>
+        <w:tc>
+          <w:tcPr>
+            <w:tcW w:type="dxa" w:w="4844"/>
+            <w:vAlign w:val="center"/>
+            <w:tcMar>
+              <w:top w:w="90" w:type="dxa"/>
+              <w:start w:w="110" w:type="dxa"/>
+              <w:bottom w:w="90" w:type="dxa"/>
+              <w:end w:w="110" w:type="dxa"/>
+            </w:tcMar>
+          </w:tcPr>
+          <w:p>
+            <w:pPr>
+              <w:spacing w:line="360" w:lineRule="auto" w:after="0"/>
+            </w:pPr>
+            <w:r>
+              <w:rPr>
+                <w:rFonts w:ascii="Times New Roman" w:hAnsi="Times New Roman" w:eastAsia="Times New Roman"/>
+                <w:b w:val="0"/>
+                <w:sz w:val="24"/>
+              </w:rPr>
+              <w:t>Полный текст запроса без персональных данных, оценок и закрытых материалов.</w:t>
+            </w:r>
+          </w:p>
+        </w:tc>
+      </w:tr>
+      <w:tr>
+        <w:tc>
+          <w:tcPr>
+            <w:tcW w:type="dxa" w:w="4844"/>
+            <w:vAlign w:val="center"/>
+            <w:tcMar>
+              <w:top w:w="90" w:type="dxa"/>
+              <w:start w:w="110" w:type="dxa"/>
+              <w:bottom w:w="90" w:type="dxa"/>
+              <w:end w:w="110" w:type="dxa"/>
+            </w:tcMar>
+          </w:tcPr>
+          <w:p>
+            <w:pPr>
+              <w:spacing w:line="360" w:lineRule="auto" w:after="0"/>
+            </w:pPr>
+            <w:r>
+              <w:rPr>
+                <w:rFonts w:ascii="Times New Roman" w:hAnsi="Times New Roman" w:eastAsia="Times New Roman"/>
+                <w:b w:val="0"/>
+                <w:sz w:val="24"/>
+              </w:rPr>
+              <w:t>Данные</w:t>
+            </w:r>
+          </w:p>
+        </w:tc>
+        <w:tc>
+          <w:tcPr>
+            <w:tcW w:type="dxa" w:w="4844"/>
+            <w:vAlign w:val="center"/>
+            <w:tcMar>
+              <w:top w:w="90" w:type="dxa"/>
+              <w:start w:w="110" w:type="dxa"/>
+              <w:bottom w:w="90" w:type="dxa"/>
+              <w:end w:w="110" w:type="dxa"/>
+            </w:tcMar>
+          </w:tcPr>
+          <w:p>
+            <w:pPr>
+              <w:spacing w:line="360" w:lineRule="auto" w:after="0"/>
+            </w:pPr>
+            <w:r>
+              <w:rPr>
+                <w:rFonts w:ascii="Times New Roman" w:hAnsi="Times New Roman" w:eastAsia="Times New Roman"/>
+                <w:b w:val="0"/>
+                <w:sz w:val="24"/>
+              </w:rPr>
+              <w:t>Источник, ссылка, лицензия, дата среза и способ подготовки.</w:t>
+            </w:r>
+          </w:p>
+        </w:tc>
+      </w:tr>
+      <w:tr>
+        <w:tc>
+          <w:tcPr>
+            <w:tcW w:type="dxa" w:w="4844"/>
+            <w:vAlign w:val="center"/>
+            <w:tcMar>
+              <w:top w:w="90" w:type="dxa"/>
+              <w:start w:w="110" w:type="dxa"/>
+              <w:bottom w:w="90" w:type="dxa"/>
+              <w:end w:w="110" w:type="dxa"/>
+            </w:tcMar>
+          </w:tcPr>
+          <w:p>
+            <w:pPr>
+              <w:spacing w:line="360" w:lineRule="auto" w:after="0"/>
+            </w:pPr>
+            <w:r>
+              <w:rPr>
+                <w:rFonts w:ascii="Times New Roman" w:hAnsi="Times New Roman" w:eastAsia="Times New Roman"/>
+                <w:b w:val="0"/>
+                <w:sz w:val="24"/>
+              </w:rPr>
+              <w:t>Параметры</w:t>
+            </w:r>
+          </w:p>
+        </w:tc>
+        <w:tc>
+          <w:tcPr>
+            <w:tcW w:type="dxa" w:w="4844"/>
+            <w:vAlign w:val="center"/>
+            <w:tcMar>
+              <w:top w:w="90" w:type="dxa"/>
+              <w:start w:w="110" w:type="dxa"/>
+              <w:bottom w:w="90" w:type="dxa"/>
+              <w:end w:w="110" w:type="dxa"/>
+            </w:tcMar>
+          </w:tcPr>
+          <w:p>
+            <w:pPr>
+              <w:spacing w:line="360" w:lineRule="auto" w:after="0"/>
+            </w:pPr>
+            <w:r>
+              <w:rPr>
+                <w:rFonts w:ascii="Times New Roman" w:hAnsi="Times New Roman" w:eastAsia="Times New Roman"/>
+                <w:b w:val="0"/>
+                <w:sz w:val="24"/>
+              </w:rPr>
+              <w:t>Алгоритм, seed, гиперпараметры, версия кода и вычислительная среда.</w:t>
+            </w:r>
+          </w:p>
+        </w:tc>
+      </w:tr>
+      <w:tr>
+        <w:tc>
+          <w:tcPr>
+            <w:tcW w:type="dxa" w:w="4844"/>
+            <w:vAlign w:val="center"/>
+            <w:tcMar>
+              <w:top w:w="90" w:type="dxa"/>
+              <w:start w:w="110" w:type="dxa"/>
+              <w:bottom w:w="90" w:type="dxa"/>
+              <w:end w:w="110" w:type="dxa"/>
+            </w:tcMar>
+          </w:tcPr>
+          <w:p>
+            <w:pPr>
+              <w:spacing w:line="360" w:lineRule="auto" w:after="0"/>
+            </w:pPr>
+            <w:r>
+              <w:rPr>
+                <w:rFonts w:ascii="Times New Roman" w:hAnsi="Times New Roman" w:eastAsia="Times New Roman"/>
+                <w:b w:val="0"/>
+                <w:sz w:val="24"/>
+              </w:rPr>
+              <w:t>Результаты</w:t>
+            </w:r>
+          </w:p>
+        </w:tc>
+        <w:tc>
+          <w:tcPr>
+            <w:tcW w:type="dxa" w:w="4844"/>
+            <w:vAlign w:val="center"/>
+            <w:tcMar>
+              <w:top w:w="90" w:type="dxa"/>
+              <w:start w:w="110" w:type="dxa"/>
+              <w:bottom w:w="90" w:type="dxa"/>
+              <w:end w:w="110" w:type="dxa"/>
+            </w:tcMar>
+          </w:tcPr>
+          <w:p>
+            <w:pPr>
+              <w:spacing w:line="360" w:lineRule="auto" w:after="0"/>
+            </w:pPr>
+            <w:r>
+              <w:rPr>
+                <w:rFonts w:ascii="Times New Roman" w:hAnsi="Times New Roman" w:eastAsia="Times New Roman"/>
+                <w:b w:val="0"/>
+                <w:sz w:val="24"/>
+              </w:rPr>
+              <w:t>Метрики, доверительные интервалы и тип значения: реальное, демонстрационное или синтетическое.</w:t>
+            </w:r>
+          </w:p>
+        </w:tc>
+      </w:tr>
+      <w:tr>
+        <w:tc>
+          <w:tcPr>
+            <w:tcW w:type="dxa" w:w="4844"/>
+            <w:vAlign w:val="center"/>
+            <w:tcMar>
+              <w:top w:w="90" w:type="dxa"/>
+              <w:start w:w="110" w:type="dxa"/>
+              <w:bottom w:w="90" w:type="dxa"/>
+              <w:end w:w="110" w:type="dxa"/>
+            </w:tcMar>
+          </w:tcPr>
+          <w:p>
+            <w:pPr>
+              <w:spacing w:line="360" w:lineRule="auto" w:after="0"/>
+            </w:pPr>
+            <w:r>
+              <w:rPr>
+                <w:rFonts w:ascii="Times New Roman" w:hAnsi="Times New Roman" w:eastAsia="Times New Roman"/>
+                <w:b w:val="0"/>
+                <w:sz w:val="24"/>
+              </w:rPr>
+              <w:t>Проверка</w:t>
+            </w:r>
+          </w:p>
+        </w:tc>
+        <w:tc>
+          <w:tcPr>
+            <w:tcW w:type="dxa" w:w="4844"/>
+            <w:vAlign w:val="center"/>
+            <w:tcMar>
+              <w:top w:w="90" w:type="dxa"/>
+              <w:start w:w="110" w:type="dxa"/>
+              <w:bottom w:w="90" w:type="dxa"/>
+              <w:end w:w="110" w:type="dxa"/>
+            </w:tcMar>
+          </w:tcPr>
+          <w:p>
+            <w:pPr>
+              <w:spacing w:line="360" w:lineRule="auto" w:after="0"/>
+            </w:pPr>
+            <w:r>
+              <w:rPr>
+                <w:rFonts w:ascii="Times New Roman" w:hAnsi="Times New Roman" w:eastAsia="Times New Roman"/>
+                <w:b w:val="0"/>
+                <w:sz w:val="24"/>
+              </w:rPr>
+              <w:t>Какие утверждения ИИ подтверждены, отклонены или требуют дополнительной проверки.</w:t>
+            </w:r>
+          </w:p>
+        </w:tc>
+      </w:tr>
+    </w:tbl>
+    <w:p>
+      <w:pPr>
+        <w:pStyle w:val="Heading2"/>
+        <w:spacing w:line="360" w:lineRule="auto" w:after="120"/>
+      </w:pPr>
+      <w:r>
+        <w:rPr>
+          <w:rFonts w:ascii="Times New Roman" w:hAnsi="Times New Roman" w:eastAsia="Times New Roman"/>
+          <w:sz w:val="28"/>
+        </w:rPr>
+        <w:t>Правила безопасного и честного использования ИИ</w:t>
+      </w:r>
+    </w:p>
+    <w:p>
+      <w:pPr>
+        <w:pStyle w:val="ListParagraph"/>
+        <w:spacing w:line="360" w:lineRule="auto" w:after="120"/>
+      </w:pPr>
+      <w:r>
+        <w:rPr>
+          <w:rFonts w:ascii="Times New Roman" w:hAnsi="Times New Roman" w:eastAsia="Times New Roman"/>
+          <w:sz w:val="28"/>
+        </w:rPr>
+        <w:t>• не передавать во внешние модели персональные данные, оценки студентов, закрытые работы и ключи доступа;</w:t>
+      </w:r>
+    </w:p>
+    <w:p>
+      <w:pPr>
+        <w:pStyle w:val="ListParagraph"/>
+        <w:spacing w:line="360" w:lineRule="auto" w:after="120"/>
+      </w:pPr>
+      <w:r>
+        <w:rPr>
+          <w:rFonts w:ascii="Times New Roman" w:hAnsi="Times New Roman" w:eastAsia="Times New Roman"/>
+          <w:sz w:val="28"/>
+        </w:rPr>
+        <w:t>• проверять факты, формулы, программный код и библиографические ссылки по первичным источникам;</w:t>
+      </w:r>
+    </w:p>
+    <w:p>
+      <w:pPr>
+        <w:pStyle w:val="ListParagraph"/>
+        <w:spacing w:line="360" w:lineRule="auto" w:after="120"/>
+      </w:pPr>
+      <w:r>
+        <w:rPr>
+          <w:rFonts w:ascii="Times New Roman" w:hAnsi="Times New Roman" w:eastAsia="Times New Roman"/>
+          <w:sz w:val="28"/>
+        </w:rPr>
+        <w:t>• явно отмечать участие ИИ и сохранять значимые промпты, ответы и собственные исправления;</w:t>
+      </w:r>
+    </w:p>
+    <w:p>
+      <w:pPr>
+        <w:pStyle w:val="ListParagraph"/>
+        <w:spacing w:line="360" w:lineRule="auto" w:after="120"/>
+      </w:pPr>
+      <w:r>
+        <w:rPr>
+          <w:rFonts w:ascii="Times New Roman" w:hAnsi="Times New Roman" w:eastAsia="Times New Roman"/>
+          <w:sz w:val="28"/>
+        </w:rPr>
+        <w:t>• не выдавать сгенерированный текст или придуманные метрики за результаты эксперимента;</w:t>
+      </w:r>
+    </w:p>
+    <w:p>
+      <w:pPr>
+        <w:pStyle w:val="ListParagraph"/>
+        <w:spacing w:line="360" w:lineRule="auto" w:after="120"/>
+      </w:pPr>
+      <w:r>
+        <w:rPr>
+          <w:rFonts w:ascii="Times New Roman" w:hAnsi="Times New Roman" w:eastAsia="Times New Roman"/>
+          <w:sz w:val="28"/>
+        </w:rPr>
+        <w:t>• отделять реальные данные от демонстрационных и синтетических значений;</w:t>
+      </w:r>
+    </w:p>
+    <w:p>
+      <w:pPr>
+        <w:pStyle w:val="ListParagraph"/>
+        <w:spacing w:line="360" w:lineRule="auto" w:after="120"/>
+      </w:pPr>
+      <w:r>
+        <w:rPr>
+          <w:rFonts w:ascii="Times New Roman" w:hAnsi="Times New Roman" w:eastAsia="Times New Roman"/>
+          <w:sz w:val="28"/>
+        </w:rPr>
+        <w:t>• итоговый вывод и ответственность за него принадлежат студенту.</w:t>
+      </w:r>
+    </w:p>
+    <w:p>
+      <w:pPr>
+        <w:pStyle w:val="Heading1"/>
+        <w:spacing w:line="360" w:lineRule="auto" w:after="120"/>
+      </w:pPr>
+      <w:r>
+        <w:rPr>
+          <w:rFonts w:ascii="Times New Roman" w:hAnsi="Times New Roman" w:eastAsia="Times New Roman"/>
+          <w:sz w:val="28"/>
+        </w:rPr>
+        <w:t>Итоговый проект по обучению с подкреплением</w:t>
+      </w:r>
+    </w:p>
+    <w:p>
+      <w:pPr>
+        <w:spacing w:line="360" w:lineRule="auto" w:after="120"/>
+      </w:pPr>
+      <w:r>
+        <w:rPr>
+          <w:rFonts w:ascii="Times New Roman" w:hAnsi="Times New Roman" w:eastAsia="Times New Roman"/>
+          <w:sz w:val="28"/>
+        </w:rPr>
+        <w:t>После выполнения четырёх лабораторных работ студент или команда до трёх человек разрабатывает итоговый проект на любую обоснованную тему по обучению с подкреплением. Можно продолжить один из стендов или выбрать другую область: управление ресурсами, робототехнику, образование, логистику, игры, рекомендации, финансы или социально значимую задачу.</w:t>
+      </w:r>
+    </w:p>
+    <w:p>
+      <w:pPr>
+        <w:spacing w:line="360" w:lineRule="auto" w:after="120"/>
+      </w:pPr>
+      <w:r>
+        <w:rPr>
+          <w:rFonts w:ascii="Times New Roman" w:hAnsi="Times New Roman" w:eastAsia="Times New Roman"/>
+          <w:sz w:val="28"/>
+        </w:rPr>
+        <w:t>Проект должен содержать исследовательский вопрос и гипотезу, обзор проверенных источников, описание среды и данных, baseline, не менее двух сопоставимых моделей, журнал происхождения, воспроизводимый эксперимент, абляции, итоговую архитектуру, ограничения и этический анализ. На защите оценивается не только результат, но и логика выбора модели, данных, метрик и проверок.</w:t>
+      </w:r>
+    </w:p>
+    <w:p>
+      <w:pPr>
+        <w:pStyle w:val="Heading1"/>
+        <w:spacing w:line="360" w:lineRule="auto" w:after="120"/>
+      </w:pPr>
+      <w:r>
+        <w:rPr>
+          <w:rFonts w:ascii="Times New Roman" w:hAnsi="Times New Roman" w:eastAsia="Times New Roman"/>
+          <w:b/>
+          <w:sz w:val="28"/>
         </w:rPr>
         <w:t>Полезные источники</w:t>
       </w:r>
     </w:p>
     <w:p>
       <w:pPr>
+        <w:spacing w:line="360" w:lineRule="auto" w:after="120"/>
         <w:ind w:firstLine="0"/>
       </w:pPr>
       <w:r>
         <w:rPr>
           <w:rFonts w:ascii="Times New Roman" w:hAnsi="Times New Roman" w:eastAsia="Times New Roman"/>
-          <w:sz w:val="24"/>
+          <w:sz w:val="28"/>
         </w:rPr>
         <w:t>Sutton &amp; Barto: http://incompleteideas.net/book/the-book-2nd.html</w:t>
       </w:r>
     </w:p>
     <w:p>
       <w:pPr>
+        <w:spacing w:line="360" w:lineRule="auto" w:after="120"/>
         <w:ind w:firstLine="0"/>
       </w:pPr>
       <w:r>
         <w:rPr>
           <w:rFonts w:ascii="Times New Roman" w:hAnsi="Times New Roman" w:eastAsia="Times New Roman"/>
-          <w:sz w:val="24"/>
+          <w:sz w:val="28"/>
         </w:rPr>
         <w:t>Finite-time UCB: https://doi.org/10.1023/A:1013689704352</w:t>
       </w:r>
     </w:p>
     <w:p>
       <w:pPr>
+        <w:spacing w:line="360" w:lineRule="auto" w:after="120"/>
         <w:ind w:firstLine="0"/>
       </w:pPr>
       <w:r>
         <w:rPr>
           <w:rFonts w:ascii="Times New Roman" w:hAnsi="Times New Roman" w:eastAsia="Times New Roman"/>
-          <w:sz w:val="24"/>
+          <w:sz w:val="28"/>
         </w:rPr>
         <w:t>Cross-Entropy Method: https://link.springer.com/book/10.1007/978-1-4757-4321-0</w:t>
       </w:r>
     </w:p>
     <w:p>
       <w:pPr>
+        <w:spacing w:line="360" w:lineRule="auto" w:after="120"/>
         <w:ind w:firstLine="0"/>
       </w:pPr>
       <w:r>
         <w:rPr>
           <w:rFonts w:ascii="Times New Roman" w:hAnsi="Times New Roman" w:eastAsia="Times New Roman"/>
-          <w:sz w:val="24"/>
+          <w:sz w:val="28"/>
         </w:rPr>
         <w:t>Интерактивная лабораторная: https://petrnikitin20.github.io/RL_education/?demo=lab1#bandit</w:t>
       </w:r>

</xml_diff>